<commit_message>
Añade escenario 3: departamento común con agentes de IA
Nueva pestaña con organigrama, pros, contras e impacto en personas;
la comparativa pasa a tres escenarios con el criterio de saturación de
planta y una decisión más. El guion de Word incluye el escenario 3.

Co-Authored-By: Claude Opus 5.5 <noreply@anthropic.com>
Claude-Session: https://claude.ai/code/session_01MjvPEuMiXFKS668Hss3mTF
</commit_message>
<xml_diff>
--- a/Guion_Presentacion_MGT_Ondupack.docx
+++ b/Guion_Presentacion_MGT_Ondupack.docx
@@ -36,7 +36,7 @@
           <w:sz w:val="21"/>
           <w:szCs w:val="21"/>
         </w:rPr>
-        <w:t xml:space="preserve">Presentación por Teams · duración aproximada 7 minutos · en azul, cuándo cambiar de pestaña</w:t>
+        <w:t xml:space="preserve">Presentación por Teams · duración aproximada 9 minutos · en azul, cuándo cambiar de pestaña</w:t>
       </w:r>
     </w:p>
     <w:p>
@@ -67,15 +67,15 @@
         <w:spacing w:after="160"/>
       </w:pPr>
       <w:r>
-        <w:t xml:space="preserve">Buenas. Se me pidió valorar dos formas de integrar la planificación entre MGT y Ondupack Almendralejo. La primera es arrancar la integración en SAP que ya se diseñó. La segunda es crear un departamento de planificación común.</w:t>
-      </w:r>
-    </w:p>
-    <w:p>
-      <w:pPr>
-        <w:spacing w:after="160"/>
-      </w:pPr>
-      <w:r>
-        <w:t xml:space="preserve">Lo voy a contar en cuatro pantallas: cómo estamos hoy, cada escenario con sus roles y una comparativa con las decisiones que harían falta para arrancar.</w:t>
+        <w:t xml:space="preserve">Buenas. Se me pidió valorar dos formas de integrar la planificación entre MGT y Ondupack Almendralejo. La primera es arrancar la integración en SAP que ya se diseñó. La segunda es crear un departamento de planificación común. He añadido una tercera, que es ese mismo departamento apoyado por agentes de IA.</w:t>
+      </w:r>
+    </w:p>
+    <w:p>
+      <w:pPr>
+        <w:spacing w:after="160"/>
+      </w:pPr>
+      <w:r>
+        <w:t xml:space="preserve">Lo voy a contar en cinco pantallas: cómo estamos hoy, cada escenario con sus roles y una comparativa con las decisiones que harían falta para arrancar.</w:t>
       </w:r>
     </w:p>
     <w:p>
@@ -330,7 +330,7 @@
         <w:spacing w:after="160"/>
       </w:pPr>
       <w:r>
-        <w:t xml:space="preserve">Elijamos el escenario que elijamos, estas siete hay que asignarlas. Eso es lo que muestran los organigramas de las dos pantallas siguientes.</w:t>
+        <w:t xml:space="preserve">Elijamos el escenario que elijamos, estas siete hay que asignarlas. Eso es lo que muestran los organigramas de las pantallas siguientes.</w:t>
       </w:r>
     </w:p>
     <w:p>
@@ -866,7 +866,7 @@
         <w:pStyle w:val="Heading1"/>
       </w:pPr>
       <w:r>
-        <w:t xml:space="preserve">Comparativa y decisiones</w:t>
+        <w:t xml:space="preserve">Escenario 3 · Departamento común con agentes de IA</w:t>
       </w:r>
     </w:p>
     <w:p>
@@ -881,109 +881,226 @@
           <w:sz w:val="21"/>
           <w:szCs w:val="21"/>
         </w:rPr>
-        <w:t xml:space="preserve">Pestaña 3 · Comparativa y decisiones · 1 minuto</w:t>
-      </w:r>
-    </w:p>
-    <w:p>
-      <w:pPr>
-        <w:spacing w:after="160"/>
-      </w:pPr>
-      <w:r>
-        <w:t xml:space="preserve">En la comparativa, en verde está qué escenario sale ganando en cada criterio. El escenario 1 gana en coste, en dependencia de personas y en impacto organizativo. El escenario 2 gana en urgentes, en arbitraje entre plantas y en rapidez de arranque. Los dos se pueden llevar al resto del grupo.</w:t>
-      </w:r>
-    </w:p>
-    <w:p>
-      <w:pPr>
-        <w:spacing w:after="160"/>
-      </w:pPr>
-      <w:r>
-        <w:t xml:space="preserve">El riesgo del escenario 1 es automatizar el desorden si los datos no están bien. El del escenario 2 es crear una capa más sin un sistema que la soporte.</w:t>
-      </w:r>
-    </w:p>
-    <w:p>
-      <w:pPr>
-        <w:spacing w:after="160"/>
-      </w:pPr>
-      <w:r>
-        <w:t xml:space="preserve">Para arrancar cualquiera de los dos, dirección tiene que tomar seis decisiones:</w:t>
-      </w:r>
-    </w:p>
-    <w:p>
-      <w:pPr>
-        <w:pStyle w:val="ListParagraph"/>
-        <w:numPr>
-          <w:ilvl w:val="0"/>
-          <w:numId w:val="4"/>
-        </w:numPr>
-        <w:spacing w:after="80"/>
-      </w:pPr>
-      <w:r>
-        <w:t xml:space="preserve">El alcance: solo la interfaz papel–cartón, o toda la planificación de ambas plantas.</w:t>
-      </w:r>
-    </w:p>
-    <w:p>
-      <w:pPr>
-        <w:pStyle w:val="ListParagraph"/>
-        <w:numPr>
-          <w:ilvl w:val="0"/>
-          <w:numId w:val="4"/>
-        </w:numPr>
-        <w:spacing w:after="80"/>
-      </w:pPr>
-      <w:r>
-        <w:t xml:space="preserve">El stock de Ondupack en MGT: de quién es, con qué límites y quién paga.</w:t>
-      </w:r>
-    </w:p>
-    <w:p>
-      <w:pPr>
-        <w:pStyle w:val="ListParagraph"/>
-        <w:numPr>
-          <w:ilvl w:val="0"/>
-          <w:numId w:val="4"/>
-        </w:numPr>
-        <w:spacing w:after="80"/>
-      </w:pPr>
-      <w:r>
-        <w:t xml:space="preserve">La prioridad de Ondupack frente a los clientes externos de MGT.</w:t>
-      </w:r>
-    </w:p>
-    <w:p>
-      <w:pPr>
-        <w:pStyle w:val="ListParagraph"/>
-        <w:numPr>
-          <w:ilvl w:val="0"/>
-          <w:numId w:val="4"/>
-        </w:numPr>
-        <w:spacing w:after="80"/>
-      </w:pPr>
-      <w:r>
-        <w:t xml:space="preserve">Si se va al escenario 2, de quién depende el responsable.</w:t>
-      </w:r>
-    </w:p>
-    <w:p>
-      <w:pPr>
-        <w:pStyle w:val="ListParagraph"/>
-        <w:numPr>
-          <w:ilvl w:val="0"/>
-          <w:numId w:val="4"/>
-        </w:numPr>
-        <w:spacing w:after="80"/>
-      </w:pPr>
-      <w:r>
-        <w:t xml:space="preserve">La fecha de corte y el horizonte congelado del ciclo.</w:t>
-      </w:r>
-    </w:p>
-    <w:p>
-      <w:pPr>
-        <w:pStyle w:val="ListParagraph"/>
-        <w:numPr>
-          <w:ilvl w:val="0"/>
-          <w:numId w:val="4"/>
-        </w:numPr>
-        <w:spacing w:after="80"/>
-      </w:pPr>
-      <w:r>
-        <w:t xml:space="preserve">Confirmar que el diseño SAP original sigue siendo válido.</w:t>
+        <w:t xml:space="preserve">Pestaña 3 · Escenario 3 · 1,5 minutos</w:t>
+      </w:r>
+    </w:p>
+    <w:p>
+      <w:pPr>
+        <w:spacing w:after="160"/>
+      </w:pPr>
+      <w:r>
+        <w:t xml:space="preserve">El escenario 3 es el mismo departamento del escenario 2, pero apoyado por agentes de IA. Los agentes proponen automáticamente los pedidos de compra y venta. Para hacerlo tienen en cuenta el porcentaje de saturación de cada planta y las necesidades actuales. El equipo valida esas propuestas y decide.</w:t>
+      </w:r>
+    </w:p>
+    <w:p>
+      <w:pPr>
+        <w:spacing w:after="160"/>
+      </w:pPr>
+      <w:r>
+        <w:t xml:space="preserve">El organigrama es el del escenario 2, con dos cambios:</w:t>
+      </w:r>
+    </w:p>
+    <w:p>
+      <w:pPr>
+        <w:pStyle w:val="ListParagraph"/>
+        <w:numPr>
+          <w:ilvl w:val="0"/>
+          <w:numId w:val="2"/>
+        </w:numPr>
+        <w:spacing w:after="80"/>
+      </w:pPr>
+      <w:r>
+        <w:t xml:space="preserve">El Responsable de planificación integrada asume también las reglas con las que trabajan los agentes.</w:t>
+      </w:r>
+    </w:p>
+    <w:p>
+      <w:pPr>
+        <w:pStyle w:val="ListParagraph"/>
+        <w:numPr>
+          <w:ilvl w:val="0"/>
+          <w:numId w:val="2"/>
+        </w:numPr>
+        <w:spacing w:after="80"/>
+      </w:pPr>
+      <w:r>
+        <w:t xml:space="preserve">El Coordinador logístico deja de grabar pedidos y pasa a validar los que propone la IA.</w:t>
+      </w:r>
+    </w:p>
+    <w:p>
+      <w:pPr>
+        <w:spacing w:after="80"/>
+      </w:pPr>
+    </w:p>
+    <w:p>
+      <w:pPr>
+        <w:spacing w:after="160"/>
+      </w:pPr>
+      <w:r>
+        <w:t xml:space="preserve">Debajo están los agentes de IA, que dan servicio a los tres puestos.</w:t>
+      </w:r>
+    </w:p>
+    <w:p>
+      <w:pPr>
+        <w:spacing w:after="160"/>
+      </w:pPr>
+      <w:r>
+        <w:t xml:space="preserve">Los pros:</w:t>
+      </w:r>
+    </w:p>
+    <w:p>
+      <w:pPr>
+        <w:pStyle w:val="ListParagraph"/>
+        <w:numPr>
+          <w:ilvl w:val="0"/>
+          <w:numId w:val="2"/>
+        </w:numPr>
+        <w:spacing w:after="80"/>
+      </w:pPr>
+      <w:r>
+        <w:t xml:space="preserve">Mantiene lo bueno del escenario 2: un dueño del plan y arbitraje con criterio de grupo.</w:t>
+      </w:r>
+    </w:p>
+    <w:p>
+      <w:pPr>
+        <w:pStyle w:val="ListParagraph"/>
+        <w:numPr>
+          <w:ilvl w:val="0"/>
+          <w:numId w:val="2"/>
+        </w:numPr>
+        <w:spacing w:after="80"/>
+      </w:pPr>
+      <w:r>
+        <w:t xml:space="preserve">Los pedidos de compra y venta se proponen automáticamente, sin grabarlos a mano.</w:t>
+      </w:r>
+    </w:p>
+    <w:p>
+      <w:pPr>
+        <w:pStyle w:val="ListParagraph"/>
+        <w:numPr>
+          <w:ilvl w:val="0"/>
+          <w:numId w:val="2"/>
+        </w:numPr>
+        <w:spacing w:after="80"/>
+      </w:pPr>
+      <w:r>
+        <w:t xml:space="preserve">Tiene en cuenta la saturación real de cada planta, no solo el stock.</w:t>
+      </w:r>
+    </w:p>
+    <w:p>
+      <w:pPr>
+        <w:pStyle w:val="ListParagraph"/>
+        <w:numPr>
+          <w:ilvl w:val="0"/>
+          <w:numId w:val="2"/>
+        </w:numPr>
+        <w:spacing w:after="80"/>
+      </w:pPr>
+      <w:r>
+        <w:t xml:space="preserve">El equipo pasa de calcular a validar y decidir.</w:t>
+      </w:r>
+    </w:p>
+    <w:p>
+      <w:pPr>
+        <w:pStyle w:val="ListParagraph"/>
+        <w:numPr>
+          <w:ilvl w:val="0"/>
+          <w:numId w:val="2"/>
+        </w:numPr>
+        <w:spacing w:after="80"/>
+      </w:pPr>
+      <w:r>
+        <w:t xml:space="preserve">Permite sumar plantas del grupo sin crecer en la misma proporción.</w:t>
+      </w:r>
+    </w:p>
+    <w:p>
+      <w:pPr>
+        <w:spacing w:after="80"/>
+      </w:pPr>
+    </w:p>
+    <w:p>
+      <w:pPr>
+        <w:spacing w:after="160"/>
+      </w:pPr>
+      <w:r>
+        <w:t xml:space="preserve">Los contras:</w:t>
+      </w:r>
+    </w:p>
+    <w:p>
+      <w:pPr>
+        <w:pStyle w:val="ListParagraph"/>
+        <w:numPr>
+          <w:ilvl w:val="0"/>
+          <w:numId w:val="2"/>
+        </w:numPr>
+        <w:spacing w:after="80"/>
+      </w:pPr>
+      <w:r>
+        <w:t xml:space="preserve">Cuesta lo mismo que el escenario 2, más el desarrollo de los agentes.</w:t>
+      </w:r>
+    </w:p>
+    <w:p>
+      <w:pPr>
+        <w:pStyle w:val="ListParagraph"/>
+        <w:numPr>
+          <w:ilvl w:val="0"/>
+          <w:numId w:val="2"/>
+        </w:numPr>
+        <w:spacing w:after="80"/>
+      </w:pPr>
+      <w:r>
+        <w:t xml:space="preserve">Necesita datos fiables y actualizados de stock, pedidos y saturación.</w:t>
+      </w:r>
+    </w:p>
+    <w:p>
+      <w:pPr>
+        <w:pStyle w:val="ListParagraph"/>
+        <w:numPr>
+          <w:ilvl w:val="0"/>
+          <w:numId w:val="2"/>
+        </w:numPr>
+        <w:spacing w:after="80"/>
+      </w:pPr>
+      <w:r>
+        <w:t xml:space="preserve">Es el de plazo más largo, porque hay que montar el equipo, los datos y los agentes.</w:t>
+      </w:r>
+    </w:p>
+    <w:p>
+      <w:pPr>
+        <w:pStyle w:val="ListParagraph"/>
+        <w:numPr>
+          <w:ilvl w:val="0"/>
+          <w:numId w:val="2"/>
+        </w:numPr>
+        <w:spacing w:after="80"/>
+      </w:pPr>
+      <w:r>
+        <w:t xml:space="preserve">Existe el riesgo de aceptar propuestas sin revisarlas.</w:t>
+      </w:r>
+    </w:p>
+    <w:p>
+      <w:pPr>
+        <w:pStyle w:val="ListParagraph"/>
+        <w:numPr>
+          <w:ilvl w:val="0"/>
+          <w:numId w:val="2"/>
+        </w:numPr>
+        <w:spacing w:after="80"/>
+      </w:pPr>
+      <w:r>
+        <w:t xml:space="preserve">Es tecnología nueva: hace falta un piloto, validarlo y mantener las reglas.</w:t>
+      </w:r>
+    </w:p>
+    <w:p>
+      <w:pPr>
+        <w:spacing w:after="80"/>
+      </w:pPr>
+    </w:p>
+    <w:p>
+      <w:pPr>
+        <w:spacing w:after="160"/>
+      </w:pPr>
+      <w:r>
+        <w:t xml:space="preserve">En cuanto a personas, la plantilla es la misma que en el escenario 2: un responsable y tres puestos. Lo que cambia es el trabajo: el equipo pasa de calcular a validar. Hace falta formar al equipo en datos e IA y contar con soporte de IT para mantener los agentes.</w:t>
       </w:r>
     </w:p>
     <w:p>
@@ -991,7 +1108,7 @@
         <w:pStyle w:val="Heading1"/>
       </w:pPr>
       <w:r>
-        <w:t xml:space="preserve">Cierre</w:t>
+        <w:t xml:space="preserve">Comparativa y decisiones</w:t>
       </w:r>
     </w:p>
     <w:p>
@@ -1006,6 +1123,144 @@
           <w:sz w:val="21"/>
           <w:szCs w:val="21"/>
         </w:rPr>
+        <w:t xml:space="preserve">Pestaña 4 · Comparativa · 1,5 minutos</w:t>
+      </w:r>
+    </w:p>
+    <w:p>
+      <w:pPr>
+        <w:spacing w:after="160"/>
+      </w:pPr>
+      <w:r>
+        <w:t xml:space="preserve">En la comparativa, en verde está qué escenario sale ganando en cada criterio. El escenario 1 gana en coste, en dependencia de personas y en impacto organizativo. El escenario 2 gana en rapidez de arranque. El 2 y el 3 ganan en urgentes y en arbitraje entre plantas. Y solo el 3 tiene en cuenta la saturación de cada planta al proponer pedidos.</w:t>
+      </w:r>
+    </w:p>
+    <w:p>
+      <w:pPr>
+        <w:spacing w:after="160"/>
+      </w:pPr>
+      <w:r>
+        <w:t xml:space="preserve">Cada uno tiene su riesgo principal. En el 1, automatizar el desorden si los datos no están bien. En el 2, crear una capa más sin un sistema que la soporte. Y en el 3, fiarse de la IA sin tener datos fiables.</w:t>
+      </w:r>
+    </w:p>
+    <w:p>
+      <w:pPr>
+        <w:spacing w:after="160"/>
+      </w:pPr>
+      <w:r>
+        <w:t xml:space="preserve">Para arrancar cualquiera de los tres, dirección tiene que tomar estas decisiones:</w:t>
+      </w:r>
+    </w:p>
+    <w:p>
+      <w:pPr>
+        <w:pStyle w:val="ListParagraph"/>
+        <w:numPr>
+          <w:ilvl w:val="0"/>
+          <w:numId w:val="4"/>
+        </w:numPr>
+        <w:spacing w:after="80"/>
+      </w:pPr>
+      <w:r>
+        <w:t xml:space="preserve">El alcance: solo la interfaz papel–cartón, o toda la planificación de ambas plantas.</w:t>
+      </w:r>
+    </w:p>
+    <w:p>
+      <w:pPr>
+        <w:pStyle w:val="ListParagraph"/>
+        <w:numPr>
+          <w:ilvl w:val="0"/>
+          <w:numId w:val="4"/>
+        </w:numPr>
+        <w:spacing w:after="80"/>
+      </w:pPr>
+      <w:r>
+        <w:t xml:space="preserve">El stock de Ondupack en MGT: de quién es, con qué límites y quién paga.</w:t>
+      </w:r>
+    </w:p>
+    <w:p>
+      <w:pPr>
+        <w:pStyle w:val="ListParagraph"/>
+        <w:numPr>
+          <w:ilvl w:val="0"/>
+          <w:numId w:val="4"/>
+        </w:numPr>
+        <w:spacing w:after="80"/>
+      </w:pPr>
+      <w:r>
+        <w:t xml:space="preserve">La prioridad de Ondupack frente a los clientes externos de MGT.</w:t>
+      </w:r>
+    </w:p>
+    <w:p>
+      <w:pPr>
+        <w:pStyle w:val="ListParagraph"/>
+        <w:numPr>
+          <w:ilvl w:val="0"/>
+          <w:numId w:val="4"/>
+        </w:numPr>
+        <w:spacing w:after="80"/>
+      </w:pPr>
+      <w:r>
+        <w:t xml:space="preserve">En los escenarios 2 y 3, de quién depende el responsable.</w:t>
+      </w:r>
+    </w:p>
+    <w:p>
+      <w:pPr>
+        <w:pStyle w:val="ListParagraph"/>
+        <w:numPr>
+          <w:ilvl w:val="0"/>
+          <w:numId w:val="4"/>
+        </w:numPr>
+        <w:spacing w:after="80"/>
+      </w:pPr>
+      <w:r>
+        <w:t xml:space="preserve">La fecha de corte y el horizonte congelado del ciclo.</w:t>
+      </w:r>
+    </w:p>
+    <w:p>
+      <w:pPr>
+        <w:pStyle w:val="ListParagraph"/>
+        <w:numPr>
+          <w:ilvl w:val="0"/>
+          <w:numId w:val="4"/>
+        </w:numPr>
+        <w:spacing w:after="80"/>
+      </w:pPr>
+      <w:r>
+        <w:t xml:space="preserve">Confirmar que el diseño SAP original sigue siendo válido.</w:t>
+      </w:r>
+    </w:p>
+    <w:p>
+      <w:pPr>
+        <w:pStyle w:val="ListParagraph"/>
+        <w:numPr>
+          <w:ilvl w:val="0"/>
+          <w:numId w:val="4"/>
+        </w:numPr>
+        <w:spacing w:after="80"/>
+      </w:pPr>
+      <w:r>
+        <w:t xml:space="preserve">En el escenario 3, qué datos alimentan a los agentes y quién valida sus propuestas.</w:t>
+      </w:r>
+    </w:p>
+    <w:p>
+      <w:pPr>
+        <w:pStyle w:val="Heading1"/>
+      </w:pPr>
+      <w:r>
+        <w:t xml:space="preserve">Cierre</w:t>
+      </w:r>
+    </w:p>
+    <w:p>
+      <w:pPr>
+        <w:spacing w:after="200" w:before="60"/>
+      </w:pPr>
+      <w:r>
+        <w:rPr>
+          <w:i/>
+          <w:iCs/>
+          <w:color w:val="0077B6"/>
+          <w:sz w:val="21"/>
+          <w:szCs w:val="21"/>
+        </w:rPr>
         <w:t xml:space="preserve">15 segundos</w:t>
       </w:r>
     </w:p>
@@ -1075,7 +1330,7 @@
         <w:spacing w:after="160"/>
       </w:pPr>
       <w:r>
-        <w:t xml:space="preserve">Empezaría por el escenario 1. No aumenta la plantilla, el diseño ya existe y elimina el trabajo manual. Durante unos meses mediría los urgentes y las discrepancias entre plantas. Si se repiten, sería la señal para pasar al escenario 2.</w:t>
+        <w:t xml:space="preserve">Empezaría por el escenario 1. No aumenta la plantilla, el diseño ya existe y elimina el trabajo manual. Durante unos meses mediría los urgentes y las discrepancias entre plantas. Si se repiten, sería la señal para pasar al escenario 2. El 3 lo veo como la evolución natural del 2, cuando los datos de stock, pedidos y saturación sean fiables.</w:t>
       </w:r>
     </w:p>
     <w:p>
@@ -1192,6 +1447,50 @@
           <w:bCs/>
           <w:color w:val="0D1B2A"/>
         </w:rPr>
+        <w:t xml:space="preserve">En el escenario 3, ¿la IA decide sola?</w:t>
+      </w:r>
+    </w:p>
+    <w:p>
+      <w:pPr>
+        <w:spacing w:after="160"/>
+      </w:pPr>
+      <w:r>
+        <w:t xml:space="preserve">No. La IA propone y las personas validan y deciden. La responsabilidad sigue siendo del equipo, y las reglas de los agentes las fija el responsable de planificación integrada.</w:t>
+      </w:r>
+    </w:p>
+    <w:p>
+      <w:pPr>
+        <w:keepNext/>
+        <w:spacing w:after="80" w:before="200"/>
+      </w:pPr>
+      <w:r>
+        <w:rPr>
+          <w:b/>
+          <w:bCs/>
+          <w:color w:val="0D1B2A"/>
+        </w:rPr>
+        <w:t xml:space="preserve">¿Qué necesita la IA para funcionar?</w:t>
+      </w:r>
+    </w:p>
+    <w:p>
+      <w:pPr>
+        <w:spacing w:after="160"/>
+      </w:pPr>
+      <w:r>
+        <w:t xml:space="preserve">Datos fiables y actualizados de stock, pedidos y saturación de cada planta. Por eso conviene tener antes la información integrada en SAP y empezar con un piloto.</w:t>
+      </w:r>
+    </w:p>
+    <w:p>
+      <w:pPr>
+        <w:keepNext/>
+        <w:spacing w:after="80" w:before="200"/>
+      </w:pPr>
+      <w:r>
+        <w:rPr>
+          <w:b/>
+          <w:bCs/>
+          <w:color w:val="0D1B2A"/>
+        </w:rPr>
         <w:t xml:space="preserve">¿Son excluyentes?</w:t>
       </w:r>
     </w:p>
@@ -1200,7 +1499,7 @@
         <w:spacing w:after="160"/>
       </w:pPr>
       <w:r>
-        <w:t xml:space="preserve">No del todo. El escenario 2 también necesitaría automatizar en SAP para no quedarse en manual. Se puede empezar por uno y evolucionar al otro.</w:t>
+        <w:t xml:space="preserve">No del todo. Los escenarios 2 y 3 también necesitarían datos integrados en SAP para no quedarse en manual, y el 3 es una evolución del 2. Se puede empezar por uno y evolucionar al siguiente.</w:t>
       </w:r>
     </w:p>
     <w:sectPr>

</xml_diff>

<commit_message>
Escenario 3: sin mínimos y máximos, el agente calcula cada pedido
Co-Authored-By: Claude Opus 5.5 <noreply@anthropic.com>
Claude-Session: https://claude.ai/code/session_01MjvPEuMiXFKS668Hss3mTF
</commit_message>
<xml_diff>
--- a/Guion_Presentacion_MGT_Ondupack.docx
+++ b/Guion_Presentacion_MGT_Ondupack.docx
@@ -897,7 +897,20 @@
         <w:spacing w:after="160"/>
       </w:pPr>
       <w:r>
-        <w:t xml:space="preserve">El organigrama es el del escenario 2, con dos cambios:</w:t>
+        <w:t xml:space="preserve">El organigrama es el del escenario 2, con tres cambios:</w:t>
+      </w:r>
+    </w:p>
+    <w:p>
+      <w:pPr>
+        <w:pStyle w:val="ListParagraph"/>
+        <w:numPr>
+          <w:ilvl w:val="0"/>
+          <w:numId w:val="2"/>
+        </w:numPr>
+        <w:spacing w:after="80"/>
+      </w:pPr>
+      <w:r>
+        <w:t xml:space="preserve">Ya no hace falta fijar mínimos y máximos, porque el agente calcula cada pedido. Los planificadores dejan de hacerlo y el responsable ya no tiene que resolver discrepancias.</w:t>
       </w:r>
     </w:p>
     <w:p>
@@ -970,7 +983,7 @@
         <w:spacing w:after="80"/>
       </w:pPr>
       <w:r>
-        <w:t xml:space="preserve">Los pedidos de compra y venta se proponen automáticamente, sin grabarlos a mano.</w:t>
+        <w:t xml:space="preserve">El agente calcula los pedidos: no hay que grabarlos a mano ni fijar mínimos y máximos.</w:t>
       </w:r>
     </w:p>
     <w:p>

</xml_diff>

<commit_message>
Vuelve a dos escenarios, añade flujos y Planificador Master
Quita el escenario 3. En el escenario 2, el Planificador Master asume
las funciones del responsable y del coordinador logístico, y los
planificadores pasan a secuenciadores. Añade un flujo por carriles en
situación actual, escenario 1 y escenario 2. Guion actualizado.

Co-Authored-By: Claude Opus 5.5 <noreply@anthropic.com>
Claude-Session: https://claude.ai/code/session_01MjvPEuMiXFKS668Hss3mTF
</commit_message>
<xml_diff>
--- a/Guion_Presentacion_MGT_Ondupack.docx
+++ b/Guion_Presentacion_MGT_Ondupack.docx
@@ -36,7 +36,7 @@
           <w:sz w:val="21"/>
           <w:szCs w:val="21"/>
         </w:rPr>
-        <w:t xml:space="preserve">Presentación por Teams · duración aproximada 9 minutos · en azul, cuándo cambiar de pestaña</w:t>
+        <w:t xml:space="preserve">Presentación por Teams · duración aproximada 8 minutos · en azul, cuándo cambiar de pestaña</w:t>
       </w:r>
     </w:p>
     <w:p>
@@ -67,15 +67,15 @@
         <w:spacing w:after="160"/>
       </w:pPr>
       <w:r>
-        <w:t xml:space="preserve">Buenas. Se me pidió valorar dos formas de integrar la planificación entre MGT y Ondupack Almendralejo. La primera es arrancar la integración en SAP que ya se diseñó. La segunda es crear un departamento de planificación común. He añadido una tercera, que es ese mismo departamento apoyado por agentes de IA.</w:t>
-      </w:r>
-    </w:p>
-    <w:p>
-      <w:pPr>
-        <w:spacing w:after="160"/>
-      </w:pPr>
-      <w:r>
-        <w:t xml:space="preserve">Lo voy a contar en cinco pantallas: cómo estamos hoy, cada escenario con sus roles y una comparativa con las decisiones que harían falta para arrancar.</w:t>
+        <w:t xml:space="preserve">Buenas. Se me pidió valorar dos formas de integrar la planificación entre MGT y Ondupack Almendralejo. La primera es arrancar la integración en SAP que ya se diseñó. La segunda es crear un departamento de planificación común.</w:t>
+      </w:r>
+    </w:p>
+    <w:p>
+      <w:pPr>
+        <w:spacing w:after="160"/>
+      </w:pPr>
+      <w:r>
+        <w:t xml:space="preserve">Lo voy a contar en cuatro pantallas: cómo estamos hoy, cada escenario con su flujo y sus roles, y una comparativa con las decisiones que harían falta para arrancar.</w:t>
       </w:r>
     </w:p>
     <w:p>
@@ -122,6 +122,14 @@
         <w:spacing w:after="160"/>
       </w:pPr>
       <w:r>
+        <w:t xml:space="preserve">En el flujo se ve el circuito actual. En rojo están los pasos que se hacen a mano o por correo: el pedido de compra, el pedido de venta, que se vuelve a grabar en MGT, y los urgentes y camiones.</w:t>
+      </w:r>
+    </w:p>
+    <w:p>
+      <w:pPr>
+        <w:spacing w:after="160"/>
+      </w:pPr>
+      <w:r>
         <w:t xml:space="preserve">En la tabla se ve en detalle:</w:t>
       </w:r>
     </w:p>
@@ -369,6 +377,14 @@
         <w:spacing w:after="160"/>
       </w:pPr>
       <w:r>
+        <w:t xml:space="preserve">En el flujo se ve el circuito. El consumo de Ondupack baja el stock y SAP detecta cuándo queda por debajo del mínimo. Entonces crea los pedidos de compra y de venta, y el Planificador de MGT los asigna a su ciclo, fabrica y envía. Los urgentes los pide Compras, y el Planificador de MGT los acepta si cumplen las reglas.</w:t>
+      </w:r>
+    </w:p>
+    <w:p>
+      <w:pPr>
+        <w:spacing w:after="160"/>
+      </w:pPr>
+      <w:r>
         <w:t xml:space="preserve">En el organigrama, la clave es que no hay puestos nuevos. Lo que cambia son funciones de puestos que ya existen:</w:t>
       </w:r>
     </w:p>
@@ -629,72 +645,67 @@
         <w:spacing w:after="160"/>
       </w:pPr>
       <w:r>
-        <w:t xml:space="preserve">El departamento depende de una dirección por encima de las dos plantas, para que sea neutral. Está formado por:</w:t>
-      </w:r>
-    </w:p>
-    <w:p>
-      <w:pPr>
-        <w:pStyle w:val="ListParagraph"/>
-        <w:numPr>
-          <w:ilvl w:val="0"/>
-          <w:numId w:val="2"/>
-        </w:numPr>
-        <w:spacing w:after="80"/>
-      </w:pPr>
-      <w:r>
-        <w:t xml:space="preserve">Un Responsable de planificación integrada, dueño del plan. Arbitra las prioridades entre plantas, resuelve las discrepancias de mínimos y máximos, decide los urgentes, sigue los KPIs y lleva los datos maestros.</w:t>
-      </w:r>
-    </w:p>
-    <w:p>
-      <w:pPr>
-        <w:pStyle w:val="ListParagraph"/>
-        <w:numPr>
-          <w:ilvl w:val="0"/>
-          <w:numId w:val="2"/>
-        </w:numPr>
-        <w:spacing w:after="80"/>
-      </w:pPr>
-      <w:r>
-        <w:t xml:space="preserve">Planificación cartón, que hace el plan de fabricación de Ondupack y las necesidades de papel.</w:t>
-      </w:r>
-    </w:p>
-    <w:p>
-      <w:pPr>
-        <w:pStyle w:val="ListParagraph"/>
-        <w:numPr>
-          <w:ilvl w:val="0"/>
-          <w:numId w:val="2"/>
-        </w:numPr>
-        <w:spacing w:after="80"/>
-      </w:pPr>
-      <w:r>
-        <w:t xml:space="preserve">Planificación papel, que lleva los ciclos de MGT, la fecha de corte y las confirmaciones.</w:t>
-      </w:r>
-    </w:p>
-    <w:p>
-      <w:pPr>
-        <w:pStyle w:val="ListParagraph"/>
-        <w:numPr>
-          <w:ilvl w:val="0"/>
-          <w:numId w:val="2"/>
-        </w:numPr>
-        <w:spacing w:after="80"/>
-      </w:pPr>
-      <w:r>
-        <w:t xml:space="preserve">Un Coordinador logístico, que lleva el stock de Ondupack en MGT, la cadencia de camiones, los pedidos de compra y venta y los informes.</w:t>
-      </w:r>
-    </w:p>
-    <w:p>
-      <w:pPr>
-        <w:spacing w:after="80"/>
-      </w:pPr>
-    </w:p>
-    <w:p>
-      <w:pPr>
-        <w:spacing w:after="160"/>
-      </w:pPr>
-      <w:r>
-        <w:t xml:space="preserve">Los dos planificadores acuerdan los mínimos y máximos. Si no se ponen de acuerdo, decide el responsable.</w:t>
+        <w:t xml:space="preserve">En el flujo se ve el circuito. Ventas aporta la demanda de clientes. El Secuenciador de cartón hace el plan de fabricación y las necesidades de papel, y el Secuenciador de papel las encaja en los ciclos de MGT. Después, el Planificador Master lanza los pedidos y organiza los camiones, y MGT fabrica el ciclo y envía.</w:t>
+      </w:r>
+    </w:p>
+    <w:p>
+      <w:pPr>
+        <w:spacing w:after="160"/>
+      </w:pPr>
+      <w:r>
+        <w:t xml:space="preserve">El departamento depende de una dirección por encima de las dos plantas, para que sea neutral. Son tres puestos:</w:t>
+      </w:r>
+    </w:p>
+    <w:p>
+      <w:pPr>
+        <w:pStyle w:val="ListParagraph"/>
+        <w:numPr>
+          <w:ilvl w:val="0"/>
+          <w:numId w:val="2"/>
+        </w:numPr>
+        <w:spacing w:after="80"/>
+      </w:pPr>
+      <w:r>
+        <w:t xml:space="preserve">El Planificador Master, dueño del plan. Lleva las prioridades y el arbitraje entre plantas; los urgentes, el stock en MGT y los camiones; los pedidos de compra y venta; y los datos maestros, los KPIs y los informes.</w:t>
+      </w:r>
+    </w:p>
+    <w:p>
+      <w:pPr>
+        <w:pStyle w:val="ListParagraph"/>
+        <w:numPr>
+          <w:ilvl w:val="0"/>
+          <w:numId w:val="2"/>
+        </w:numPr>
+        <w:spacing w:after="80"/>
+      </w:pPr>
+      <w:r>
+        <w:t xml:space="preserve">El Secuenciador de cartón, que hace el plan de fabricación de Ondupack y las necesidades de papel.</w:t>
+      </w:r>
+    </w:p>
+    <w:p>
+      <w:pPr>
+        <w:pStyle w:val="ListParagraph"/>
+        <w:numPr>
+          <w:ilvl w:val="0"/>
+          <w:numId w:val="2"/>
+        </w:numPr>
+        <w:spacing w:after="80"/>
+      </w:pPr>
+      <w:r>
+        <w:t xml:space="preserve">El Secuenciador de papel, que lleva los ciclos de MGT, la fecha de corte y las confirmaciones.</w:t>
+      </w:r>
+    </w:p>
+    <w:p>
+      <w:pPr>
+        <w:spacing w:after="80"/>
+      </w:pPr>
+    </w:p>
+    <w:p>
+      <w:pPr>
+        <w:spacing w:after="160"/>
+      </w:pPr>
+      <w:r>
+        <w:t xml:space="preserve">Los dos secuenciadores acuerdan los mínimos y máximos. Si no se ponen de acuerdo, decide el Planificador Master.</w:t>
       </w:r>
     </w:p>
     <w:p>
@@ -858,7 +869,7 @@
         <w:spacing w:after="160"/>
       </w:pPr>
       <w:r>
-        <w:t xml:space="preserve">En cuanto a personas, son un responsable y tres puestos, que pueden salir de MGT y Ondupack o ser incorporaciones nuevas. Cambia la dependencia jerárquica y quizá la ubicación, y es un proceso formal con RRHH.</w:t>
+        <w:t xml:space="preserve">En cuanto a personas, son tres puestos, que pueden salir de MGT y Ondupack o ser incorporaciones nuevas. Cambia la dependencia jerárquica y quizá la ubicación, y es un proceso formal con RRHH.</w:t>
       </w:r>
     </w:p>
     <w:p>
@@ -866,7 +877,7 @@
         <w:pStyle w:val="Heading1"/>
       </w:pPr>
       <w:r>
-        <w:t xml:space="preserve">Escenario 3 · Departamento común con agentes de IA</w:t>
+        <w:t xml:space="preserve">Comparativa y decisiones</w:t>
       </w:r>
     </w:p>
     <w:p>
@@ -881,239 +892,109 @@
           <w:sz w:val="21"/>
           <w:szCs w:val="21"/>
         </w:rPr>
-        <w:t xml:space="preserve">Pestaña 3 · Escenario 3 · 1,5 minutos</w:t>
-      </w:r>
-    </w:p>
-    <w:p>
-      <w:pPr>
-        <w:spacing w:after="160"/>
-      </w:pPr>
-      <w:r>
-        <w:t xml:space="preserve">El escenario 3 es el mismo departamento del escenario 2, pero apoyado por agentes de IA. Los agentes proponen automáticamente los pedidos de compra y venta. Para hacerlo tienen en cuenta el porcentaje de saturación de cada planta y las necesidades actuales. El equipo valida esas propuestas y decide.</w:t>
-      </w:r>
-    </w:p>
-    <w:p>
-      <w:pPr>
-        <w:spacing w:after="160"/>
-      </w:pPr>
-      <w:r>
-        <w:t xml:space="preserve">El organigrama es el del escenario 2, con tres cambios:</w:t>
-      </w:r>
-    </w:p>
-    <w:p>
-      <w:pPr>
-        <w:pStyle w:val="ListParagraph"/>
-        <w:numPr>
-          <w:ilvl w:val="0"/>
-          <w:numId w:val="2"/>
-        </w:numPr>
-        <w:spacing w:after="80"/>
-      </w:pPr>
-      <w:r>
-        <w:t xml:space="preserve">Ya no hace falta fijar mínimos y máximos, porque el agente calcula cada pedido. Los planificadores dejan de hacerlo y el responsable ya no tiene que resolver discrepancias.</w:t>
-      </w:r>
-    </w:p>
-    <w:p>
-      <w:pPr>
-        <w:pStyle w:val="ListParagraph"/>
-        <w:numPr>
-          <w:ilvl w:val="0"/>
-          <w:numId w:val="2"/>
-        </w:numPr>
-        <w:spacing w:after="80"/>
-      </w:pPr>
-      <w:r>
-        <w:t xml:space="preserve">El Responsable de planificación integrada asume también las reglas con las que trabajan los agentes.</w:t>
-      </w:r>
-    </w:p>
-    <w:p>
-      <w:pPr>
-        <w:pStyle w:val="ListParagraph"/>
-        <w:numPr>
-          <w:ilvl w:val="0"/>
-          <w:numId w:val="2"/>
-        </w:numPr>
-        <w:spacing w:after="80"/>
-      </w:pPr>
-      <w:r>
-        <w:t xml:space="preserve">El Coordinador logístico deja de grabar pedidos y pasa a validar los que propone la IA.</w:t>
-      </w:r>
-    </w:p>
-    <w:p>
-      <w:pPr>
-        <w:spacing w:after="80"/>
-      </w:pPr>
-    </w:p>
-    <w:p>
-      <w:pPr>
-        <w:spacing w:after="160"/>
-      </w:pPr>
-      <w:r>
-        <w:t xml:space="preserve">Debajo están los agentes de IA, que dan servicio a los tres puestos.</w:t>
-      </w:r>
-    </w:p>
-    <w:p>
-      <w:pPr>
-        <w:spacing w:after="160"/>
-      </w:pPr>
-      <w:r>
-        <w:t xml:space="preserve">Los pros:</w:t>
-      </w:r>
-    </w:p>
-    <w:p>
-      <w:pPr>
-        <w:pStyle w:val="ListParagraph"/>
-        <w:numPr>
-          <w:ilvl w:val="0"/>
-          <w:numId w:val="2"/>
-        </w:numPr>
-        <w:spacing w:after="80"/>
-      </w:pPr>
-      <w:r>
-        <w:t xml:space="preserve">Mantiene lo bueno del escenario 2: un dueño del plan y arbitraje con criterio de grupo.</w:t>
-      </w:r>
-    </w:p>
-    <w:p>
-      <w:pPr>
-        <w:pStyle w:val="ListParagraph"/>
-        <w:numPr>
-          <w:ilvl w:val="0"/>
-          <w:numId w:val="2"/>
-        </w:numPr>
-        <w:spacing w:after="80"/>
-      </w:pPr>
-      <w:r>
-        <w:t xml:space="preserve">El agente calcula los pedidos: no hay que grabarlos a mano ni fijar mínimos y máximos.</w:t>
-      </w:r>
-    </w:p>
-    <w:p>
-      <w:pPr>
-        <w:pStyle w:val="ListParagraph"/>
-        <w:numPr>
-          <w:ilvl w:val="0"/>
-          <w:numId w:val="2"/>
-        </w:numPr>
-        <w:spacing w:after="80"/>
-      </w:pPr>
-      <w:r>
-        <w:t xml:space="preserve">Tiene en cuenta la saturación real de cada planta, no solo el stock.</w:t>
-      </w:r>
-    </w:p>
-    <w:p>
-      <w:pPr>
-        <w:pStyle w:val="ListParagraph"/>
-        <w:numPr>
-          <w:ilvl w:val="0"/>
-          <w:numId w:val="2"/>
-        </w:numPr>
-        <w:spacing w:after="80"/>
-      </w:pPr>
-      <w:r>
-        <w:t xml:space="preserve">El equipo pasa de calcular a validar y decidir.</w:t>
-      </w:r>
-    </w:p>
-    <w:p>
-      <w:pPr>
-        <w:pStyle w:val="ListParagraph"/>
-        <w:numPr>
-          <w:ilvl w:val="0"/>
-          <w:numId w:val="2"/>
-        </w:numPr>
-        <w:spacing w:after="80"/>
-      </w:pPr>
-      <w:r>
-        <w:t xml:space="preserve">Permite sumar plantas del grupo sin crecer en la misma proporción.</w:t>
-      </w:r>
-    </w:p>
-    <w:p>
-      <w:pPr>
-        <w:spacing w:after="80"/>
-      </w:pPr>
-    </w:p>
-    <w:p>
-      <w:pPr>
-        <w:spacing w:after="160"/>
-      </w:pPr>
-      <w:r>
-        <w:t xml:space="preserve">Los contras:</w:t>
-      </w:r>
-    </w:p>
-    <w:p>
-      <w:pPr>
-        <w:pStyle w:val="ListParagraph"/>
-        <w:numPr>
-          <w:ilvl w:val="0"/>
-          <w:numId w:val="2"/>
-        </w:numPr>
-        <w:spacing w:after="80"/>
-      </w:pPr>
-      <w:r>
-        <w:t xml:space="preserve">Cuesta lo mismo que el escenario 2, más el desarrollo de los agentes.</w:t>
-      </w:r>
-    </w:p>
-    <w:p>
-      <w:pPr>
-        <w:pStyle w:val="ListParagraph"/>
-        <w:numPr>
-          <w:ilvl w:val="0"/>
-          <w:numId w:val="2"/>
-        </w:numPr>
-        <w:spacing w:after="80"/>
-      </w:pPr>
-      <w:r>
-        <w:t xml:space="preserve">Necesita datos fiables y actualizados de stock, pedidos y saturación.</w:t>
-      </w:r>
-    </w:p>
-    <w:p>
-      <w:pPr>
-        <w:pStyle w:val="ListParagraph"/>
-        <w:numPr>
-          <w:ilvl w:val="0"/>
-          <w:numId w:val="2"/>
-        </w:numPr>
-        <w:spacing w:after="80"/>
-      </w:pPr>
-      <w:r>
-        <w:t xml:space="preserve">Es el de plazo más largo, porque hay que montar el equipo, los datos y los agentes.</w:t>
-      </w:r>
-    </w:p>
-    <w:p>
-      <w:pPr>
-        <w:pStyle w:val="ListParagraph"/>
-        <w:numPr>
-          <w:ilvl w:val="0"/>
-          <w:numId w:val="2"/>
-        </w:numPr>
-        <w:spacing w:after="80"/>
-      </w:pPr>
-      <w:r>
-        <w:t xml:space="preserve">Existe el riesgo de aceptar propuestas sin revisarlas.</w:t>
-      </w:r>
-    </w:p>
-    <w:p>
-      <w:pPr>
-        <w:pStyle w:val="ListParagraph"/>
-        <w:numPr>
-          <w:ilvl w:val="0"/>
-          <w:numId w:val="2"/>
-        </w:numPr>
-        <w:spacing w:after="80"/>
-      </w:pPr>
-      <w:r>
-        <w:t xml:space="preserve">Es tecnología nueva: hace falta un piloto, validarlo y mantener las reglas.</w:t>
-      </w:r>
-    </w:p>
-    <w:p>
-      <w:pPr>
-        <w:spacing w:after="80"/>
-      </w:pPr>
-    </w:p>
-    <w:p>
-      <w:pPr>
-        <w:spacing w:after="160"/>
-      </w:pPr>
-      <w:r>
-        <w:t xml:space="preserve">En cuanto a personas, la plantilla es la misma que en el escenario 2: un responsable y tres puestos. Lo que cambia es el trabajo: el equipo pasa de calcular a validar. Hace falta formar al equipo en datos e IA y contar con soporte de IT para mantener los agentes.</w:t>
+        <w:t xml:space="preserve">Pestaña 3 · Comparativa · 1 minuto</w:t>
+      </w:r>
+    </w:p>
+    <w:p>
+      <w:pPr>
+        <w:spacing w:after="160"/>
+      </w:pPr>
+      <w:r>
+        <w:t xml:space="preserve">En la comparativa, en verde está qué escenario sale ganando en cada criterio. El escenario 1 gana en coste, en dependencia de personas y en impacto organizativo. El escenario 2 gana en urgentes, en arbitraje entre plantas y en rapidez de arranque. Los dos se pueden llevar al resto del grupo.</w:t>
+      </w:r>
+    </w:p>
+    <w:p>
+      <w:pPr>
+        <w:spacing w:after="160"/>
+      </w:pPr>
+      <w:r>
+        <w:t xml:space="preserve">El riesgo del escenario 1 es automatizar el desorden si los datos no están bien. El del escenario 2 es crear una capa más sin un sistema que la soporte.</w:t>
+      </w:r>
+    </w:p>
+    <w:p>
+      <w:pPr>
+        <w:spacing w:after="160"/>
+      </w:pPr>
+      <w:r>
+        <w:t xml:space="preserve">Para arrancar cualquiera de los dos, dirección tiene que tomar seis decisiones:</w:t>
+      </w:r>
+    </w:p>
+    <w:p>
+      <w:pPr>
+        <w:pStyle w:val="ListParagraph"/>
+        <w:numPr>
+          <w:ilvl w:val="0"/>
+          <w:numId w:val="4"/>
+        </w:numPr>
+        <w:spacing w:after="80"/>
+      </w:pPr>
+      <w:r>
+        <w:t xml:space="preserve">El alcance: solo la interfaz papel–cartón, o toda la planificación de ambas plantas.</w:t>
+      </w:r>
+    </w:p>
+    <w:p>
+      <w:pPr>
+        <w:pStyle w:val="ListParagraph"/>
+        <w:numPr>
+          <w:ilvl w:val="0"/>
+          <w:numId w:val="4"/>
+        </w:numPr>
+        <w:spacing w:after="80"/>
+      </w:pPr>
+      <w:r>
+        <w:t xml:space="preserve">El stock de Ondupack en MGT: de quién es, con qué límites y quién paga.</w:t>
+      </w:r>
+    </w:p>
+    <w:p>
+      <w:pPr>
+        <w:pStyle w:val="ListParagraph"/>
+        <w:numPr>
+          <w:ilvl w:val="0"/>
+          <w:numId w:val="4"/>
+        </w:numPr>
+        <w:spacing w:after="80"/>
+      </w:pPr>
+      <w:r>
+        <w:t xml:space="preserve">La prioridad de Ondupack frente a los clientes externos de MGT.</w:t>
+      </w:r>
+    </w:p>
+    <w:p>
+      <w:pPr>
+        <w:pStyle w:val="ListParagraph"/>
+        <w:numPr>
+          <w:ilvl w:val="0"/>
+          <w:numId w:val="4"/>
+        </w:numPr>
+        <w:spacing w:after="80"/>
+      </w:pPr>
+      <w:r>
+        <w:t xml:space="preserve">Si se va al escenario 2, de quién depende el Planificador Master.</w:t>
+      </w:r>
+    </w:p>
+    <w:p>
+      <w:pPr>
+        <w:pStyle w:val="ListParagraph"/>
+        <w:numPr>
+          <w:ilvl w:val="0"/>
+          <w:numId w:val="4"/>
+        </w:numPr>
+        <w:spacing w:after="80"/>
+      </w:pPr>
+      <w:r>
+        <w:t xml:space="preserve">La fecha de corte y el horizonte congelado del ciclo.</w:t>
+      </w:r>
+    </w:p>
+    <w:p>
+      <w:pPr>
+        <w:pStyle w:val="ListParagraph"/>
+        <w:numPr>
+          <w:ilvl w:val="0"/>
+          <w:numId w:val="4"/>
+        </w:numPr>
+        <w:spacing w:after="80"/>
+      </w:pPr>
+      <w:r>
+        <w:t xml:space="preserve">Confirmar que el diseño SAP original sigue siendo válido.</w:t>
       </w:r>
     </w:p>
     <w:p>
@@ -1121,7 +1002,7 @@
         <w:pStyle w:val="Heading1"/>
       </w:pPr>
       <w:r>
-        <w:t xml:space="preserve">Comparativa y decisiones</w:t>
+        <w:t xml:space="preserve">Cierre</w:t>
       </w:r>
     </w:p>
     <w:p>
@@ -1136,144 +1017,6 @@
           <w:sz w:val="21"/>
           <w:szCs w:val="21"/>
         </w:rPr>
-        <w:t xml:space="preserve">Pestaña 4 · Comparativa · 1,5 minutos</w:t>
-      </w:r>
-    </w:p>
-    <w:p>
-      <w:pPr>
-        <w:spacing w:after="160"/>
-      </w:pPr>
-      <w:r>
-        <w:t xml:space="preserve">En la comparativa, en verde está qué escenario sale ganando en cada criterio. El escenario 1 gana en coste, en dependencia de personas y en impacto organizativo. El escenario 2 gana en rapidez de arranque. El 2 y el 3 ganan en urgentes y en arbitraje entre plantas. Y solo el 3 tiene en cuenta la saturación de cada planta al proponer pedidos.</w:t>
-      </w:r>
-    </w:p>
-    <w:p>
-      <w:pPr>
-        <w:spacing w:after="160"/>
-      </w:pPr>
-      <w:r>
-        <w:t xml:space="preserve">Cada uno tiene su riesgo principal. En el 1, automatizar el desorden si los datos no están bien. En el 2, crear una capa más sin un sistema que la soporte. Y en el 3, fiarse de la IA sin tener datos fiables.</w:t>
-      </w:r>
-    </w:p>
-    <w:p>
-      <w:pPr>
-        <w:spacing w:after="160"/>
-      </w:pPr>
-      <w:r>
-        <w:t xml:space="preserve">Para arrancar cualquiera de los tres, dirección tiene que tomar estas decisiones:</w:t>
-      </w:r>
-    </w:p>
-    <w:p>
-      <w:pPr>
-        <w:pStyle w:val="ListParagraph"/>
-        <w:numPr>
-          <w:ilvl w:val="0"/>
-          <w:numId w:val="4"/>
-        </w:numPr>
-        <w:spacing w:after="80"/>
-      </w:pPr>
-      <w:r>
-        <w:t xml:space="preserve">El alcance: solo la interfaz papel–cartón, o toda la planificación de ambas plantas.</w:t>
-      </w:r>
-    </w:p>
-    <w:p>
-      <w:pPr>
-        <w:pStyle w:val="ListParagraph"/>
-        <w:numPr>
-          <w:ilvl w:val="0"/>
-          <w:numId w:val="4"/>
-        </w:numPr>
-        <w:spacing w:after="80"/>
-      </w:pPr>
-      <w:r>
-        <w:t xml:space="preserve">El stock de Ondupack en MGT: de quién es, con qué límites y quién paga.</w:t>
-      </w:r>
-    </w:p>
-    <w:p>
-      <w:pPr>
-        <w:pStyle w:val="ListParagraph"/>
-        <w:numPr>
-          <w:ilvl w:val="0"/>
-          <w:numId w:val="4"/>
-        </w:numPr>
-        <w:spacing w:after="80"/>
-      </w:pPr>
-      <w:r>
-        <w:t xml:space="preserve">La prioridad de Ondupack frente a los clientes externos de MGT.</w:t>
-      </w:r>
-    </w:p>
-    <w:p>
-      <w:pPr>
-        <w:pStyle w:val="ListParagraph"/>
-        <w:numPr>
-          <w:ilvl w:val="0"/>
-          <w:numId w:val="4"/>
-        </w:numPr>
-        <w:spacing w:after="80"/>
-      </w:pPr>
-      <w:r>
-        <w:t xml:space="preserve">En los escenarios 2 y 3, de quién depende el responsable.</w:t>
-      </w:r>
-    </w:p>
-    <w:p>
-      <w:pPr>
-        <w:pStyle w:val="ListParagraph"/>
-        <w:numPr>
-          <w:ilvl w:val="0"/>
-          <w:numId w:val="4"/>
-        </w:numPr>
-        <w:spacing w:after="80"/>
-      </w:pPr>
-      <w:r>
-        <w:t xml:space="preserve">La fecha de corte y el horizonte congelado del ciclo.</w:t>
-      </w:r>
-    </w:p>
-    <w:p>
-      <w:pPr>
-        <w:pStyle w:val="ListParagraph"/>
-        <w:numPr>
-          <w:ilvl w:val="0"/>
-          <w:numId w:val="4"/>
-        </w:numPr>
-        <w:spacing w:after="80"/>
-      </w:pPr>
-      <w:r>
-        <w:t xml:space="preserve">Confirmar que el diseño SAP original sigue siendo válido.</w:t>
-      </w:r>
-    </w:p>
-    <w:p>
-      <w:pPr>
-        <w:pStyle w:val="ListParagraph"/>
-        <w:numPr>
-          <w:ilvl w:val="0"/>
-          <w:numId w:val="4"/>
-        </w:numPr>
-        <w:spacing w:after="80"/>
-      </w:pPr>
-      <w:r>
-        <w:t xml:space="preserve">En el escenario 3, qué datos alimentan a los agentes y quién valida sus propuestas.</w:t>
-      </w:r>
-    </w:p>
-    <w:p>
-      <w:pPr>
-        <w:pStyle w:val="Heading1"/>
-      </w:pPr>
-      <w:r>
-        <w:t xml:space="preserve">Cierre</w:t>
-      </w:r>
-    </w:p>
-    <w:p>
-      <w:pPr>
-        <w:spacing w:after="200" w:before="60"/>
-      </w:pPr>
-      <w:r>
-        <w:rPr>
-          <w:i/>
-          <w:iCs/>
-          <w:color w:val="0077B6"/>
-          <w:sz w:val="21"/>
-          <w:szCs w:val="21"/>
-        </w:rPr>
         <w:t xml:space="preserve">15 segundos</w:t>
       </w:r>
     </w:p>
@@ -1343,7 +1086,7 @@
         <w:spacing w:after="160"/>
       </w:pPr>
       <w:r>
-        <w:t xml:space="preserve">Empezaría por el escenario 1. No aumenta la plantilla, el diseño ya existe y elimina el trabajo manual. Durante unos meses mediría los urgentes y las discrepancias entre plantas. Si se repiten, sería la señal para pasar al escenario 2. El 3 lo veo como la evolución natural del 2, cuando los datos de stock, pedidos y saturación sean fiables.</w:t>
+        <w:t xml:space="preserve">Empezaría por el escenario 1. No aumenta la plantilla, el diseño ya existe y elimina el trabajo manual. Durante unos meses mediría los urgentes y las discrepancias entre plantas. Si se repiten, sería la señal para pasar al escenario 2.</w:t>
       </w:r>
     </w:p>
     <w:p>
@@ -1460,50 +1203,6 @@
           <w:bCs/>
           <w:color w:val="0D1B2A"/>
         </w:rPr>
-        <w:t xml:space="preserve">En el escenario 3, ¿la IA decide sola?</w:t>
-      </w:r>
-    </w:p>
-    <w:p>
-      <w:pPr>
-        <w:spacing w:after="160"/>
-      </w:pPr>
-      <w:r>
-        <w:t xml:space="preserve">No. La IA propone y las personas validan y deciden. La responsabilidad sigue siendo del equipo, y las reglas de los agentes las fija el responsable de planificación integrada.</w:t>
-      </w:r>
-    </w:p>
-    <w:p>
-      <w:pPr>
-        <w:keepNext/>
-        <w:spacing w:after="80" w:before="200"/>
-      </w:pPr>
-      <w:r>
-        <w:rPr>
-          <w:b/>
-          <w:bCs/>
-          <w:color w:val="0D1B2A"/>
-        </w:rPr>
-        <w:t xml:space="preserve">¿Qué necesita la IA para funcionar?</w:t>
-      </w:r>
-    </w:p>
-    <w:p>
-      <w:pPr>
-        <w:spacing w:after="160"/>
-      </w:pPr>
-      <w:r>
-        <w:t xml:space="preserve">Datos fiables y actualizados de stock, pedidos y saturación de cada planta. Por eso conviene tener antes la información integrada en SAP y empezar con un piloto.</w:t>
-      </w:r>
-    </w:p>
-    <w:p>
-      <w:pPr>
-        <w:keepNext/>
-        <w:spacing w:after="80" w:before="200"/>
-      </w:pPr>
-      <w:r>
-        <w:rPr>
-          <w:b/>
-          <w:bCs/>
-          <w:color w:val="0D1B2A"/>
-        </w:rPr>
         <w:t xml:space="preserve">¿Son excluyentes?</w:t>
       </w:r>
     </w:p>
@@ -1512,7 +1211,7 @@
         <w:spacing w:after="160"/>
       </w:pPr>
       <w:r>
-        <w:t xml:space="preserve">No del todo. Los escenarios 2 y 3 también necesitarían datos integrados en SAP para no quedarse en manual, y el 3 es una evolución del 2. Se puede empezar por uno y evolucionar al siguiente.</w:t>
+        <w:t xml:space="preserve">No del todo. El escenario 2 también necesitaría automatizar en SAP para no quedarse en manual. Se puede empezar por uno y evolucionar al otro.</w:t>
       </w:r>
     </w:p>
     <w:sectPr>

</xml_diff>

<commit_message>
Escenario 2: el Planificador Master aprueba el Plan Maestro
En el flujo se quita la etiqueta de pedidos a mano y se destaca que el
Planificador Master aprueba el Plan Maestro, coordina ambas áreas y
resuelve urgentes. Organigrama, nota y guion alineados.

Co-Authored-By: Claude Opus 5.5 <noreply@anthropic.com>
Claude-Session: https://claude.ai/code/session_01MjvPEuMiXFKS668Hss3mTF
</commit_message>
<xml_diff>
--- a/Guion_Presentacion_MGT_Ondupack.docx
+++ b/Guion_Presentacion_MGT_Ondupack.docx
@@ -645,7 +645,7 @@
         <w:spacing w:after="160"/>
       </w:pPr>
       <w:r>
-        <w:t xml:space="preserve">En el flujo se ve el circuito. Ventas aporta la demanda de clientes. El Secuenciador de cartón hace el plan de fabricación y las necesidades de papel, y el Secuenciador de papel las encaja en los ciclos de MGT. Después, el Planificador Master lanza los pedidos y organiza los camiones, y MGT fabrica el ciclo y envía.</w:t>
+        <w:t xml:space="preserve">En el flujo se ve el circuito. Ventas aporta la demanda de clientes. El Secuenciador de cartón hace el plan de fabricación y las necesidades de papel, y el Secuenciador de papel las encaja en los ciclos de MGT. Después, el Planificador Master aprueba el Plan Maestro, coordina las dos áreas y resuelve los conflictos de urgentes. Con el plan aprobado, MGT fabrica el ciclo y envía.</w:t>
       </w:r>
     </w:p>
     <w:p>
@@ -666,7 +666,7 @@
         <w:spacing w:after="80"/>
       </w:pPr>
       <w:r>
-        <w:t xml:space="preserve">El Planificador Master, dueño del plan. Lleva las prioridades y el arbitraje entre plantas; los urgentes, el stock en MGT y los camiones; los pedidos de compra y venta; y los datos maestros, los KPIs y los informes.</w:t>
+        <w:t xml:space="preserve">El Planificador Master, que aprueba el Plan Maestro y coordina las dos áreas. Resuelve los conflictos de urgentes y lleva el stock en MGT, los camiones, los pedidos de compra y venta, los datos maestros, los KPIs y los informes.</w:t>
       </w:r>
     </w:p>
     <w:p>

</xml_diff>